<commit_message>
Episode 04: producer's corrections (يا لها من فرحة، حججت) and student's question shown in the lesson picture
Co-Authored-By: Claude Opus 5.5 <noreply@anthropic.com>
</commit_message>
<xml_diff>
--- a/production/thumma_ihtadayt/recovered_scripts/episodes_01_06/HIKAYA_Thumma_Ihtadayt_Episodes_01-06_Scripts.docx
+++ b/production/thumma_ihtadayt/recovered_scripts/episodes_01_06/HIKAYA_Thumma_Ihtadayt_Episodes_01-06_Scripts.docx
@@ -4959,6 +4959,25 @@
           <w:szCs w:val="17"/>
           <w:rtl/>
         </w:rPr>
+        <w:t xml:space="preserve">‏تصحيح من المنتج: «لعا» ← «لها»</w:t>
+      </w:r>
+    </w:p>
+    <w:p>
+      <w:pPr>
+        <w:keepNext/>
+        <w:bidi/>
+        <w:spacing w:after="20" w:before="0" w:line="300"/>
+      </w:pPr>
+      <w:r>
+        <w:rPr>
+          <w:rFonts w:ascii="Arial" w:cs="Arial" w:hAnsi="Arial"/>
+          <w:b w:val="false"/>
+          <w:i w:val="false"/>
+          <w:color w:val="7A6A55"/>
+          <w:sz w:val="17"/>
+          <w:szCs w:val="17"/>
+          <w:rtl/>
+        </w:rPr>
         <w:t xml:space="preserve">‏Ep4.zip/Hisyouth1.wav · 2.50–7.82 ث</w:t>
       </w:r>
     </w:p>
@@ -5014,7 +5033,7 @@
           <w:szCs w:val="26"/>
           <w:rtl/>
         </w:rPr>
-        <w:t xml:space="preserve">‏يا لعا من فرحة لم أتخيل أن عودتي من الحج ستصبح مناسبة تحتفل بها المدينة كلها</w:t>
+        <w:t xml:space="preserve">‏يا لها من فرحة لم أتخيل أن عودتي من الحج ستصبح مناسبة تحتفل بها المدينة كلها</w:t>
       </w:r>
     </w:p>
     <w:p>
@@ -5605,6 +5624,25 @@
           <w:szCs w:val="17"/>
           <w:rtl/>
         </w:rPr>
+        <w:t xml:space="preserve">‏تصحيح من المنتج: «حجشت» ← «حججت»</w:t>
+      </w:r>
+    </w:p>
+    <w:p>
+      <w:pPr>
+        <w:keepNext/>
+        <w:bidi/>
+        <w:spacing w:after="20" w:before="0" w:line="300"/>
+      </w:pPr>
+      <w:r>
+        <w:rPr>
+          <w:rFonts w:ascii="Arial" w:cs="Arial" w:hAnsi="Arial"/>
+          <w:b w:val="false"/>
+          <w:i w:val="false"/>
+          <w:color w:val="7A6A55"/>
+          <w:sz w:val="17"/>
+          <w:szCs w:val="17"/>
+          <w:rtl/>
+        </w:rPr>
         <w:t xml:space="preserve">‏Ep4.zip/Neighbour.wav · 0.00–7.68 ث</w:t>
       </w:r>
     </w:p>
@@ -5623,7 +5661,7 @@
           <w:szCs w:val="26"/>
           <w:rtl/>
         </w:rPr>
-        <w:t xml:space="preserve">‏الحمد لله على سلامتك يا حاج محمد ما شاء الله حجشت بيت الله وانت في هذه السن الصغيرة</w:t>
+        <w:t xml:space="preserve">‏الحمد لله على سلامتك يا حاج محمد ما شاء الله حججت بيت الله وانت في هذه السن الصغيرة</w:t>
       </w:r>
     </w:p>
     <w:p>

</xml_diff>

<commit_message>
Producer's corrections: episodes 04 05
Co-Authored-By: Claude Opus 5.5 <noreply@anthropic.com>
</commit_message>
<xml_diff>
--- a/production/thumma_ihtadayt/recovered_scripts/episodes_01_06/HIKAYA_Thumma_Ihtadayt_Episodes_01-06_Scripts.docx
+++ b/production/thumma_ihtadayt/recovered_scripts/episodes_01_06/HIKAYA_Thumma_Ihtadayt_Episodes_01-06_Scripts.docx
@@ -615,7 +615,7 @@
                 <w:szCs w:val="20"/>
                 <w:rtl/>
               </w:rPr>
-              <w:t xml:space="preserve">‏الراوي، التيجاني الشاب، موفد الشيخ، الشيخ إسماعيل الهديفي، أحد أتباع الطريقة، الزوجة</w:t>
+              <w:t xml:space="preserve">‏الراوي، التيجاني الشاب، موفد الشيخ، الشيخ إسماعيل الهادفي، أحد أتباع الطريقة، الزوجة</w:t>
             </w:r>
           </w:p>
         </w:tc>
@@ -4497,6 +4497,25 @@
           <w:szCs w:val="17"/>
           <w:rtl/>
         </w:rPr>
+        <w:t xml:space="preserve">‏تصحيح من المنتج: «وثيقته» ← «وثقته»</w:t>
+      </w:r>
+    </w:p>
+    <w:p>
+      <w:pPr>
+        <w:keepNext/>
+        <w:bidi/>
+        <w:spacing w:after="20" w:before="0" w:line="300"/>
+      </w:pPr>
+      <w:r>
+        <w:rPr>
+          <w:rFonts w:ascii="Arial" w:cs="Arial" w:hAnsi="Arial"/>
+          <w:b w:val="false"/>
+          <w:i w:val="false"/>
+          <w:color w:val="7A6A55"/>
+          <w:sz w:val="17"/>
+          <w:szCs w:val="17"/>
+          <w:rtl/>
+        </w:rPr>
         <w:t xml:space="preserve">‏Ep4.zip/Narrator4.wav · 2.50–14.42 ث</w:t>
       </w:r>
     </w:p>
@@ -4848,7 +4867,7 @@
           <w:szCs w:val="26"/>
           <w:rtl/>
         </w:rPr>
-        <w:t xml:space="preserve">‏كانت مكانته تتسع وثيقته بأفكاره تزداد لكن الحياة كانت تعد له لقاء جديدا لقاء سيضع أمامه طريقين مختلفين وسؤالا لن يستطيع الهروب منه</w:t>
+        <w:t xml:space="preserve">‏كانت مكانته تتسع وثقته بأفكاره تزداد لكن الحياة كانت تعد له لقاء جديدا لقاء سيضع أمامه طريقين مختلفين وسؤالا لن يستطيع الهروب منه</w:t>
       </w:r>
     </w:p>
     <w:p>
@@ -6107,6 +6126,63 @@
           <w:szCs w:val="17"/>
           <w:rtl/>
         </w:rPr>
+        <w:t xml:space="preserve">‏تصحيح من المنتج: «الهاتفي» ← «الهادفي»</w:t>
+      </w:r>
+    </w:p>
+    <w:p>
+      <w:pPr>
+        <w:keepNext/>
+        <w:bidi/>
+        <w:spacing w:after="20" w:before="0" w:line="300"/>
+      </w:pPr>
+      <w:r>
+        <w:rPr>
+          <w:rFonts w:ascii="Arial" w:cs="Arial" w:hAnsi="Arial"/>
+          <w:b w:val="false"/>
+          <w:i w:val="false"/>
+          <w:color w:val="7A6A55"/>
+          <w:sz w:val="17"/>
+          <w:szCs w:val="17"/>
+          <w:rtl/>
+        </w:rPr>
+        <w:t xml:space="preserve">‏تصحيح من المنتج: «لاستدلال» ← «الاستدلال»</w:t>
+      </w:r>
+    </w:p>
+    <w:p>
+      <w:pPr>
+        <w:keepNext/>
+        <w:bidi/>
+        <w:spacing w:after="20" w:before="0" w:line="300"/>
+      </w:pPr>
+      <w:r>
+        <w:rPr>
+          <w:rFonts w:ascii="Arial" w:cs="Arial" w:hAnsi="Arial"/>
+          <w:b w:val="false"/>
+          <w:i w:val="false"/>
+          <w:color w:val="7A6A55"/>
+          <w:sz w:val="17"/>
+          <w:szCs w:val="17"/>
+          <w:rtl/>
+        </w:rPr>
+        <w:t xml:space="preserve">‏تصحيح من المنتج: «للطراب» ← «الاضطراب»</w:t>
+      </w:r>
+    </w:p>
+    <w:p>
+      <w:pPr>
+        <w:keepNext/>
+        <w:bidi/>
+        <w:spacing w:after="20" w:before="0" w:line="300"/>
+      </w:pPr>
+      <w:r>
+        <w:rPr>
+          <w:rFonts w:ascii="Arial" w:cs="Arial" w:hAnsi="Arial"/>
+          <w:b w:val="false"/>
+          <w:i w:val="false"/>
+          <w:color w:val="7A6A55"/>
+          <w:sz w:val="17"/>
+          <w:szCs w:val="17"/>
+          <w:rtl/>
+        </w:rPr>
         <w:t xml:space="preserve">‏Ep5.zip/Narrator5.wav · 1.54–15.72 ث</w:t>
       </w:r>
     </w:p>
@@ -6125,7 +6201,7 @@
           <w:szCs w:val="26"/>
           <w:rtl/>
         </w:rPr>
-        <w:t xml:space="preserve">‏بينما كان محمد التيجاني يواصل دروسه الدينية في مدينة قفصة وصلته دعوة غير متوقعة كانت الدعوة من أتباع الشيخ إسماعيل الهاتفي أحد مشايخ التصوف المعروفين في مدينة توزر</w:t>
+        <w:t xml:space="preserve">‏بينما كان محمد التيجاني يواصل دروسه الدينية في مدينة قفصة وصلته دعوة غير متوقعة كانت الدعوة من أتباع الشيخ إسماعيل الهادفي أحد مشايخ التصوف المعروفين في مدينة توزر</w:t>
       </w:r>
     </w:p>
     <w:p>
@@ -6347,7 +6423,7 @@
           <w:szCs w:val="26"/>
           <w:rtl/>
         </w:rPr>
-        <w:t xml:space="preserve">‏لكن محمد لم يستطع أن يمنع نفسه من السؤال والمناقشة كان يستمع إلى بعض أجوبة الشيخ ثم يعترض عليها محاولا لاستدلال بالقرآن والسنة ضاق بعض الحاضرين بكلامه ورأوا فيه تجاوزا لآداب مجلس الشيخ أما الشيخ اسماعيل فتعامل مع الموقف بهدوء</w:t>
+        <w:t xml:space="preserve">‏لكن محمد لم يستطع أن يمنع نفسه من السؤال والمناقشة كان يستمع إلى بعض أجوبة الشيخ ثم يعترض عليها محاولا الاستدلال بالقرآن والسنة ضاق بعض الحاضرين بكلامه ورأوا فيه تجاوزا لآداب مجلس الشيخ أما الشيخ اسماعيل فتعامل مع الموقف بهدوء</w:t>
       </w:r>
     </w:p>
     <w:p>
@@ -6532,7 +6608,7 @@
           <w:szCs w:val="26"/>
           <w:rtl/>
         </w:rPr>
-        <w:t xml:space="preserve">‏وبلغ به للطراب أنه سقط باكيا لم يكن يعرف أي الطريقين يتبع وعلى الرغم من أن الشيخ عينه وكينا له في قفصه لم تنتهي حيرته بل استمرت الأسئلة ترافقه حتى بعد عودته وكان بعض المريدين يجتمعون في منزله لإقامة حلقات الذكر ثم بدأت شكاوى الجيران تصل إلى زوجته بسبب ارتفاع الأصوات</w:t>
+        <w:t xml:space="preserve">‏وبلغ به الاضطراب أنه سقط باكيا لم يكن يعرف أي الطريقين يتبع وعلى الرغم من أن الشيخ عينه وكينا له في قفصه لم تنتهي حيرته بل استمرت الأسئلة ترافقه حتى بعد عودته وكان بعض المريدين يجتمعون في منزله لإقامة حلقات الذكر ثم بدأت شكاوى الجيران تصل إلى زوجته بسبب ارتفاع الأصوات</w:t>
       </w:r>
     </w:p>
     <w:p>
@@ -6680,6 +6756,44 @@
           <w:szCs w:val="17"/>
           <w:rtl/>
         </w:rPr>
+        <w:t xml:space="preserve">‏تصحيح من المنتج: «الآتراض» ← «الاعتراض»</w:t>
+      </w:r>
+    </w:p>
+    <w:p>
+      <w:pPr>
+        <w:keepNext/>
+        <w:bidi/>
+        <w:spacing w:after="20" w:before="0" w:line="300"/>
+      </w:pPr>
+      <w:r>
+        <w:rPr>
+          <w:rFonts w:ascii="Arial" w:cs="Arial" w:hAnsi="Arial"/>
+          <w:b w:val="false"/>
+          <w:i w:val="false"/>
+          <w:color w:val="7A6A55"/>
+          <w:sz w:val="17"/>
+          <w:szCs w:val="17"/>
+          <w:rtl/>
+        </w:rPr>
+        <w:t xml:space="preserve">‏تصحيح من المنتج: «الاحتراض» ← «الاعتراض»</w:t>
+      </w:r>
+    </w:p>
+    <w:p>
+      <w:pPr>
+        <w:keepNext/>
+        <w:bidi/>
+        <w:spacing w:after="20" w:before="0" w:line="300"/>
+      </w:pPr>
+      <w:r>
+        <w:rPr>
+          <w:rFonts w:ascii="Arial" w:cs="Arial" w:hAnsi="Arial"/>
+          <w:b w:val="false"/>
+          <w:i w:val="false"/>
+          <w:color w:val="7A6A55"/>
+          <w:sz w:val="17"/>
+          <w:szCs w:val="17"/>
+          <w:rtl/>
+        </w:rPr>
         <w:t xml:space="preserve">‏Ep5.zip/Hisyouth5.wav · 0.00–10.16 ث</w:t>
       </w:r>
     </w:p>
@@ -6749,30 +6863,30 @@
           <w:rFonts w:ascii="Arial" w:cs="Arial" w:hAnsi="Arial"/>
           <w:b w:val="false"/>
           <w:i w:val="false"/>
-          <w:color w:val="7A6A55"/>
-          <w:sz w:val="17"/>
-          <w:szCs w:val="17"/>
-          <w:rtl/>
-        </w:rPr>
-        <w:t xml:space="preserve">‏Ep5.zip/Hisyouth5.wav · 29.42–35.04 ث</w:t>
-      </w:r>
-    </w:p>
-    <w:p>
-      <w:pPr>
-        <w:bidi/>
-        <w:spacing w:after="140" w:before="0" w:line="360"/>
-      </w:pPr>
-      <w:r>
-        <w:rPr>
-          <w:rFonts w:ascii="Arial" w:cs="Arial" w:hAnsi="Arial"/>
-          <w:b w:val="false"/>
-          <w:i w:val="false"/>
-          <w:color w:val="2E2419"/>
-          <w:sz w:val="26"/>
-          <w:szCs w:val="26"/>
-          <w:rtl/>
-        </w:rPr>
-        <w:t xml:space="preserve">‏أنا لا أريد الآتراض لمجرد الاحتراض ولكنني أبحث عن الدليل</w:t>
+          <w:color w:val="A33A1E"/>
+          <w:sz w:val="17"/>
+          <w:szCs w:val="17"/>
+          <w:rtl/>
+        </w:rPr>
+        <w:t xml:space="preserve">‏Ep5.zip/Hisyouth5.wav · 29.42–35.04 ث · ⚠ يختلف التفريغان — راجع بالسماع</w:t>
+      </w:r>
+    </w:p>
+    <w:p>
+      <w:pPr>
+        <w:bidi/>
+        <w:spacing w:after="140" w:before="0" w:line="360"/>
+      </w:pPr>
+      <w:r>
+        <w:rPr>
+          <w:rFonts w:ascii="Arial" w:cs="Arial" w:hAnsi="Arial"/>
+          <w:b w:val="false"/>
+          <w:i w:val="false"/>
+          <w:color w:val="2E2419"/>
+          <w:sz w:val="26"/>
+          <w:szCs w:val="26"/>
+          <w:rtl/>
+        </w:rPr>
+        <w:t xml:space="preserve">‏أنا لا أريد الاعتراض لمجرد الاعتراض ولكنني أبحث عن الدليل</w:t>
       </w:r>
     </w:p>
     <w:p>
@@ -7369,7 +7483,7 @@
           <w:szCs w:val="28"/>
           <w:rtl/>
         </w:rPr>
-        <w:t xml:space="preserve">‏الشيخ إسماعيل الهديفي</w:t>
+        <w:t xml:space="preserve">‏الشيخ إسماعيل الهادفي</w:t>
       </w:r>
       <w:r>
         <w:rPr>
@@ -8011,6 +8125,44 @@
           <w:szCs w:val="17"/>
           <w:rtl/>
         </w:rPr>
+        <w:t xml:space="preserve">‏تصحيح من المنتج: «جئنا» ← «جئن»</w:t>
+      </w:r>
+    </w:p>
+    <w:p>
+      <w:pPr>
+        <w:keepNext/>
+        <w:bidi/>
+        <w:spacing w:after="20" w:before="0" w:line="300"/>
+      </w:pPr>
+      <w:r>
+        <w:rPr>
+          <w:rFonts w:ascii="Arial" w:cs="Arial" w:hAnsi="Arial"/>
+          <w:b w:val="false"/>
+          <w:i w:val="false"/>
+          <w:color w:val="7A6A55"/>
+          <w:sz w:val="17"/>
+          <w:szCs w:val="17"/>
+          <w:rtl/>
+        </w:rPr>
+        <w:t xml:space="preserve">‏تصحيح من المنتج: «تجتمع» ← «تجتمعوا»</w:t>
+      </w:r>
+    </w:p>
+    <w:p>
+      <w:pPr>
+        <w:keepNext/>
+        <w:bidi/>
+        <w:spacing w:after="20" w:before="0" w:line="300"/>
+      </w:pPr>
+      <w:r>
+        <w:rPr>
+          <w:rFonts w:ascii="Arial" w:cs="Arial" w:hAnsi="Arial"/>
+          <w:b w:val="false"/>
+          <w:i w:val="false"/>
+          <w:color w:val="7A6A55"/>
+          <w:sz w:val="17"/>
+          <w:szCs w:val="17"/>
+          <w:rtl/>
+        </w:rPr>
         <w:t xml:space="preserve">‏Ep5.zip/Wife.wav · 0.00–3.06 ث</w:t>
       </w:r>
     </w:p>
@@ -8066,7 +8218,7 @@
           <w:szCs w:val="26"/>
           <w:rtl/>
         </w:rPr>
-        <w:t xml:space="preserve">‏بعض نساء الجيران جئنا يشتكين من الأصوات المرتفعة في مجالس الذكر التي تقام عندنا</w:t>
+        <w:t xml:space="preserve">‏بعض نساء الجيران جئن يشتكين من الأصوات المرتفعة في مجالس الذكر التي تقام عندنا</w:t>
       </w:r>
     </w:p>
     <w:p>
@@ -8117,30 +8269,30 @@
           <w:rFonts w:ascii="Arial" w:cs="Arial" w:hAnsi="Arial"/>
           <w:b w:val="false"/>
           <w:i w:val="false"/>
-          <w:color w:val="A33A1E"/>
-          <w:sz w:val="17"/>
-          <w:szCs w:val="17"/>
-          <w:rtl/>
-        </w:rPr>
-        <w:t xml:space="preserve">‏Ep5.zip/Wife.wav · 24.28–28.44 ث · ⚠ يختلف التفريغان — راجع بالسماع</w:t>
-      </w:r>
-    </w:p>
-    <w:p>
-      <w:pPr>
-        <w:bidi/>
-        <w:spacing w:after="140" w:before="0" w:line="360"/>
-      </w:pPr>
-      <w:r>
-        <w:rPr>
-          <w:rFonts w:ascii="Arial" w:cs="Arial" w:hAnsi="Arial"/>
-          <w:b w:val="false"/>
-          <w:i w:val="false"/>
-          <w:color w:val="2E2419"/>
-          <w:sz w:val="26"/>
-          <w:szCs w:val="26"/>
-          <w:rtl/>
-        </w:rPr>
-        <w:t xml:space="preserve">‏ربما كان من الأفضل أن تجتمع في مكان آخر</w:t>
+          <w:color w:val="7A6A55"/>
+          <w:sz w:val="17"/>
+          <w:szCs w:val="17"/>
+          <w:rtl/>
+        </w:rPr>
+        <w:t xml:space="preserve">‏Ep5.zip/Wife.wav · 24.28–28.44 ث</w:t>
+      </w:r>
+    </w:p>
+    <w:p>
+      <w:pPr>
+        <w:bidi/>
+        <w:spacing w:after="140" w:before="0" w:line="360"/>
+      </w:pPr>
+      <w:r>
+        <w:rPr>
+          <w:rFonts w:ascii="Arial" w:cs="Arial" w:hAnsi="Arial"/>
+          <w:b w:val="false"/>
+          <w:i w:val="false"/>
+          <w:color w:val="2E2419"/>
+          <w:sz w:val="26"/>
+          <w:szCs w:val="26"/>
+          <w:rtl/>
+        </w:rPr>
+        <w:t xml:space="preserve">‏ربما كان من الأفضل أن تجتمعوا في مكان آخر</w:t>
       </w:r>
     </w:p>
     <w:p>
@@ -8383,6 +8535,25 @@
           <w:szCs w:val="17"/>
           <w:rtl/>
         </w:rPr>
+        <w:t xml:space="preserve">‏تصحيح من المنتج: «الباصط» ← «الباسط»</w:t>
+      </w:r>
+    </w:p>
+    <w:p>
+      <w:pPr>
+        <w:keepNext/>
+        <w:bidi/>
+        <w:spacing w:after="20" w:before="0" w:line="300"/>
+      </w:pPr>
+      <w:r>
+        <w:rPr>
+          <w:rFonts w:ascii="Arial" w:cs="Arial" w:hAnsi="Arial"/>
+          <w:b w:val="false"/>
+          <w:i w:val="false"/>
+          <w:color w:val="7A6A55"/>
+          <w:sz w:val="17"/>
+          <w:szCs w:val="17"/>
+          <w:rtl/>
+        </w:rPr>
         <w:t xml:space="preserve">‏Ep6.zip/Narration.wav · 0.00–11.58 ث</w:t>
       </w:r>
     </w:p>
@@ -8549,7 +8720,7 @@
           <w:szCs w:val="26"/>
           <w:rtl/>
         </w:rPr>
-        <w:t xml:space="preserve">‏لم تكن القاهرة بالنسبة إليه مجرد مدينة جديدة كانت عالماً واسعاً من المساجد والعلماء والفنانين والأفكار زار الموسيقار فريد الأطرش في عمارته المطلة على نهر النيل لكنه لم يمكث معه سوى عشرين دقيقة لأن الفنان كان يستعد للسفر إلى لبنان ثم جاءت زيارة أخرى تركت في نفسه أثراً مميزاً لقد التقى القارئ الشهير الشيخ عبد الباصط محمد عبد الصمد وقضى معه ثلاثة أيام دارت خلالها أحاديث واسعة مع أقاربه وأصدقائه كان المجلس ينتقل من الفن إلى الدين ومن التصوف إلى السياسة ومن التاريخ إلى العلوم وكان محمد يشارك بحماس في كل موضوع</w:t>
+        <w:t xml:space="preserve">‏لم تكن القاهرة بالنسبة إليه مجرد مدينة جديدة كانت عالماً واسعاً من المساجد والعلماء والفنانين والأفكار زار الموسيقار فريد الأطرش في عمارته المطلة على نهر النيل لكنه لم يمكث معه سوى عشرين دقيقة لأن الفنان كان يستعد للسفر إلى لبنان ثم جاءت زيارة أخرى تركت في نفسه أثراً مميزاً لقد التقى القارئ الشهير الشيخ عبد الباسط محمد عبد الصمد وقضى معه ثلاثة أيام دارت خلالها أحاديث واسعة مع أقاربه وأصدقائه كان المجلس ينتقل من الفن إلى الدين ومن التصوف إلى السياسة ومن التاريخ إلى العلوم وكان محمد يشارك بحماس في كل موضوع</w:t>
       </w:r>
     </w:p>
     <w:p>
@@ -8919,6 +9090,25 @@
           <w:szCs w:val="17"/>
           <w:rtl/>
         </w:rPr>
+        <w:t xml:space="preserve">‏تصحيح من المنتج: «به» ← «بي»</w:t>
+      </w:r>
+    </w:p>
+    <w:p>
+      <w:pPr>
+        <w:keepNext/>
+        <w:bidi/>
+        <w:spacing w:after="20" w:before="0" w:line="300"/>
+      </w:pPr>
+      <w:r>
+        <w:rPr>
+          <w:rFonts w:ascii="Arial" w:cs="Arial" w:hAnsi="Arial"/>
+          <w:b w:val="false"/>
+          <w:i w:val="false"/>
+          <w:color w:val="7A6A55"/>
+          <w:sz w:val="17"/>
+          <w:szCs w:val="17"/>
+          <w:rtl/>
+        </w:rPr>
         <w:t xml:space="preserve">‏Ep6.zip/Youth.wav · 0.00–7.74 ث</w:t>
       </w:r>
     </w:p>
@@ -9196,7 +9386,7 @@
           <w:szCs w:val="26"/>
           <w:rtl/>
         </w:rPr>
-        <w:t xml:space="preserve">‏ولكن هل كنت أعرف حقا كل ما ينبغي أن أعرفه؟ أم أن إعجاب الناس به جعلني أرى نفسي أكبر مما أنا عليه</w:t>
+        <w:t xml:space="preserve">‏ولكن هل كنت أعرف حقا كل ما ينبغي أن أعرفه؟ أم أن إعجاب الناس بي جعلني أرى نفسي أكبر مما أنا عليه</w:t>
       </w:r>
     </w:p>
     <w:p>
@@ -9455,6 +9645,63 @@
           <w:szCs w:val="17"/>
           <w:rtl/>
         </w:rPr>
+        <w:t xml:space="preserve">‏تصحيح من المنتج: «أنهي» ← «أي»</w:t>
+      </w:r>
+    </w:p>
+    <w:p>
+      <w:pPr>
+        <w:keepNext/>
+        <w:bidi/>
+        <w:spacing w:after="20" w:before="0" w:line="300"/>
+      </w:pPr>
+      <w:r>
+        <w:rPr>
+          <w:rFonts w:ascii="Arial" w:cs="Arial" w:hAnsi="Arial"/>
+          <w:b w:val="false"/>
+          <w:i w:val="false"/>
+          <w:color w:val="7A6A55"/>
+          <w:sz w:val="17"/>
+          <w:szCs w:val="17"/>
+          <w:rtl/>
+        </w:rPr>
+        <w:t xml:space="preserve">‏تصحيح من المنتج: «الأديمة» ← «القديمة»</w:t>
+      </w:r>
+    </w:p>
+    <w:p>
+      <w:pPr>
+        <w:keepNext/>
+        <w:bidi/>
+        <w:spacing w:after="20" w:before="0" w:line="300"/>
+      </w:pPr>
+      <w:r>
+        <w:rPr>
+          <w:rFonts w:ascii="Arial" w:cs="Arial" w:hAnsi="Arial"/>
+          <w:b w:val="false"/>
+          <w:i w:val="false"/>
+          <w:color w:val="7A6A55"/>
+          <w:sz w:val="17"/>
+          <w:szCs w:val="17"/>
+          <w:rtl/>
+        </w:rPr>
+        <w:t xml:space="preserve">‏تصحيح من المنتج: «يشوف» ← «تشوف»</w:t>
+      </w:r>
+    </w:p>
+    <w:p>
+      <w:pPr>
+        <w:keepNext/>
+        <w:bidi/>
+        <w:spacing w:after="20" w:before="0" w:line="300"/>
+      </w:pPr>
+      <w:r>
+        <w:rPr>
+          <w:rFonts w:ascii="Arial" w:cs="Arial" w:hAnsi="Arial"/>
+          <w:b w:val="false"/>
+          <w:i w:val="false"/>
+          <w:color w:val="7A6A55"/>
+          <w:sz w:val="17"/>
+          <w:szCs w:val="17"/>
+          <w:rtl/>
+        </w:rPr>
         <w:t xml:space="preserve">‏Ep6.zip/Ahmedegy.wav · 0.00–5.76 ث</w:t>
       </w:r>
     </w:p>
@@ -9635,30 +9882,30 @@
           <w:rFonts w:ascii="Arial" w:cs="Arial" w:hAnsi="Arial"/>
           <w:b w:val="false"/>
           <w:i w:val="false"/>
-          <w:color w:val="7A6A55"/>
-          <w:sz w:val="17"/>
-          <w:szCs w:val="17"/>
-          <w:rtl/>
-        </w:rPr>
-        <w:t xml:space="preserve">‏Ep6.zip/Ahmedegy.wav · 36.10–43.44 ث</w:t>
-      </w:r>
-    </w:p>
-    <w:p>
-      <w:pPr>
-        <w:bidi/>
-        <w:spacing w:after="140" w:before="0" w:line="360"/>
-      </w:pPr>
-      <w:r>
-        <w:rPr>
-          <w:rFonts w:ascii="Arial" w:cs="Arial" w:hAnsi="Arial"/>
-          <w:b w:val="false"/>
-          <w:i w:val="false"/>
-          <w:color w:val="2E2419"/>
-          <w:sz w:val="26"/>
-          <w:szCs w:val="26"/>
-          <w:rtl/>
-        </w:rPr>
-        <w:t xml:space="preserve">‏تحب نزور أنهي مكان الأول الأزهر ولا المساجد الأديمة ولا تحب يشوف النيل</w:t>
+          <w:color w:val="A33A1E"/>
+          <w:sz w:val="17"/>
+          <w:szCs w:val="17"/>
+          <w:rtl/>
+        </w:rPr>
+        <w:t xml:space="preserve">‏Ep6.zip/Ahmedegy.wav · 36.10–43.44 ث · ⚠ يختلف التفريغان — راجع بالسماع</w:t>
+      </w:r>
+    </w:p>
+    <w:p>
+      <w:pPr>
+        <w:bidi/>
+        <w:spacing w:after="140" w:before="0" w:line="360"/>
+      </w:pPr>
+      <w:r>
+        <w:rPr>
+          <w:rFonts w:ascii="Arial" w:cs="Arial" w:hAnsi="Arial"/>
+          <w:b w:val="false"/>
+          <w:i w:val="false"/>
+          <w:color w:val="2E2419"/>
+          <w:sz w:val="26"/>
+          <w:szCs w:val="26"/>
+          <w:rtl/>
+        </w:rPr>
+        <w:t xml:space="preserve">‏تحب نزور أي مكان الأول الأزهر ولا المساجد القديمة ولا تحب تشوف النيل</w:t>
       </w:r>
     </w:p>
     <w:p>
@@ -9745,234 +9992,272 @@
           <w:rFonts w:ascii="Arial" w:cs="Arial" w:hAnsi="Arial"/>
           <w:b w:val="false"/>
           <w:i w:val="false"/>
+          <w:color w:val="7A6A55"/>
+          <w:sz w:val="17"/>
+          <w:szCs w:val="17"/>
+          <w:rtl/>
+        </w:rPr>
+        <w:t xml:space="preserve">‏نسبة الملف إلى الشخصية: أكده المنتج: الشيخ عبد الباسط (اسم الملف Atrash)</w:t>
+      </w:r>
+    </w:p>
+    <w:p>
+      <w:pPr>
+        <w:keepNext/>
+        <w:bidi/>
+        <w:spacing w:after="20" w:before="0" w:line="300"/>
+      </w:pPr>
+      <w:r>
+        <w:rPr>
+          <w:rFonts w:ascii="Arial" w:cs="Arial" w:hAnsi="Arial"/>
+          <w:b w:val="false"/>
+          <w:i w:val="false"/>
+          <w:color w:val="7A6A55"/>
+          <w:sz w:val="17"/>
+          <w:szCs w:val="17"/>
+          <w:rtl/>
+        </w:rPr>
+        <w:t xml:space="preserve">‏تصحيح من المنتج: «طرى» ← «ترى»</w:t>
+      </w:r>
+    </w:p>
+    <w:p>
+      <w:pPr>
+        <w:keepNext/>
+        <w:bidi/>
+        <w:spacing w:after="20" w:before="0" w:line="300"/>
+      </w:pPr>
+      <w:r>
+        <w:rPr>
+          <w:rFonts w:ascii="Arial" w:cs="Arial" w:hAnsi="Arial"/>
+          <w:b w:val="false"/>
+          <w:i w:val="false"/>
+          <w:color w:val="7A6A55"/>
+          <w:sz w:val="17"/>
+          <w:szCs w:val="17"/>
+          <w:rtl/>
+        </w:rPr>
+        <w:t xml:space="preserve">‏تصحيح من المنتج: «يوفأك» ← «يوفقك»</w:t>
+      </w:r>
+    </w:p>
+    <w:p>
+      <w:pPr>
+        <w:keepNext/>
+        <w:bidi/>
+        <w:spacing w:after="20" w:before="0" w:line="300"/>
+      </w:pPr>
+      <w:r>
+        <w:rPr>
+          <w:rFonts w:ascii="Arial" w:cs="Arial" w:hAnsi="Arial"/>
+          <w:b w:val="false"/>
+          <w:i w:val="false"/>
+          <w:color w:val="7A6A55"/>
+          <w:sz w:val="17"/>
+          <w:szCs w:val="17"/>
+          <w:rtl/>
+        </w:rPr>
+        <w:t xml:space="preserve">‏Ep6.zip/Atrash.wav · 0.00–5.92 ث</w:t>
+      </w:r>
+    </w:p>
+    <w:p>
+      <w:pPr>
+        <w:bidi/>
+        <w:spacing w:after="140" w:before="0" w:line="360"/>
+      </w:pPr>
+      <w:r>
+        <w:rPr>
+          <w:rFonts w:ascii="Arial" w:cs="Arial" w:hAnsi="Arial"/>
+          <w:b w:val="false"/>
+          <w:i w:val="false"/>
+          <w:color w:val="2E2419"/>
+          <w:sz w:val="26"/>
+          <w:szCs w:val="26"/>
+          <w:rtl/>
+        </w:rPr>
+        <w:t xml:space="preserve">‏أهلاً بيك يا أستاذ محمد نورتنا وأهلاً بأهل تونس الكرام</w:t>
+      </w:r>
+    </w:p>
+    <w:p>
+      <w:pPr>
+        <w:keepNext/>
+        <w:bidi/>
+        <w:spacing w:after="20" w:before="0" w:line="300"/>
+      </w:pPr>
+      <w:r>
+        <w:rPr>
+          <w:rFonts w:ascii="Arial" w:cs="Arial" w:hAnsi="Arial"/>
+          <w:b w:val="false"/>
+          <w:i w:val="false"/>
+          <w:color w:val="7A6A55"/>
+          <w:sz w:val="17"/>
+          <w:szCs w:val="17"/>
+          <w:rtl/>
+        </w:rPr>
+        <w:t xml:space="preserve">‏Ep6.zip/Atrash.wav · 7.92–14.82 ث</w:t>
+      </w:r>
+    </w:p>
+    <w:p>
+      <w:pPr>
+        <w:bidi/>
+        <w:spacing w:after="140" w:before="0" w:line="360"/>
+      </w:pPr>
+      <w:r>
+        <w:rPr>
+          <w:rFonts w:ascii="Arial" w:cs="Arial" w:hAnsi="Arial"/>
+          <w:b w:val="false"/>
+          <w:i w:val="false"/>
+          <w:color w:val="2E2419"/>
+          <w:sz w:val="26"/>
+          <w:szCs w:val="26"/>
+          <w:rtl/>
+        </w:rPr>
+        <w:t xml:space="preserve">‏بلغني إنك مهتم بالقرآن والعلم وإنك سافرت بلاداً كثيرة</w:t>
+      </w:r>
+    </w:p>
+    <w:p>
+      <w:pPr>
+        <w:keepNext/>
+        <w:bidi/>
+        <w:spacing w:after="20" w:before="0" w:line="300"/>
+      </w:pPr>
+      <w:r>
+        <w:rPr>
+          <w:rFonts w:ascii="Arial" w:cs="Arial" w:hAnsi="Arial"/>
+          <w:b w:val="false"/>
+          <w:i w:val="false"/>
+          <w:color w:val="7A6A55"/>
+          <w:sz w:val="17"/>
+          <w:szCs w:val="17"/>
+          <w:rtl/>
+        </w:rPr>
+        <w:t xml:space="preserve">‏Ep6.zip/Atrash.wav · 16.70–24.26 ث</w:t>
+      </w:r>
+    </w:p>
+    <w:p>
+      <w:pPr>
+        <w:bidi/>
+        <w:spacing w:after="140" w:before="0" w:line="360"/>
+      </w:pPr>
+      <w:r>
+        <w:rPr>
+          <w:rFonts w:ascii="Arial" w:cs="Arial" w:hAnsi="Arial"/>
+          <w:b w:val="false"/>
+          <w:i w:val="false"/>
+          <w:color w:val="2E2419"/>
+          <w:sz w:val="26"/>
+          <w:szCs w:val="26"/>
+          <w:rtl/>
+        </w:rPr>
+        <w:t xml:space="preserve">‏احكي لنا عن رحلتك إلى مكة كيف كان شعورك وأنت ترى بيت الله الحرام لأول مرة</w:t>
+      </w:r>
+    </w:p>
+    <w:p>
+      <w:pPr>
+        <w:keepNext/>
+        <w:bidi/>
+        <w:spacing w:after="20" w:before="0" w:line="300"/>
+      </w:pPr>
+      <w:r>
+        <w:rPr>
+          <w:rFonts w:ascii="Arial" w:cs="Arial" w:hAnsi="Arial"/>
+          <w:b w:val="false"/>
+          <w:i w:val="false"/>
+          <w:color w:val="7A6A55"/>
+          <w:sz w:val="17"/>
+          <w:szCs w:val="17"/>
+          <w:rtl/>
+        </w:rPr>
+        <w:t xml:space="preserve">‏Ep6.zip/Atrash.wav · 27.52–33.64 ث</w:t>
+      </w:r>
+    </w:p>
+    <w:p>
+      <w:pPr>
+        <w:bidi/>
+        <w:spacing w:after="140" w:before="0" w:line="360"/>
+      </w:pPr>
+      <w:r>
+        <w:rPr>
+          <w:rFonts w:ascii="Arial" w:cs="Arial" w:hAnsi="Arial"/>
+          <w:b w:val="false"/>
+          <w:i w:val="false"/>
+          <w:color w:val="2E2419"/>
+          <w:sz w:val="26"/>
+          <w:szCs w:val="26"/>
+          <w:rtl/>
+        </w:rPr>
+        <w:t xml:space="preserve">‏ما شاء الله واضح إن الرحلة تركت في نفسك أثرا كبيرا</w:t>
+      </w:r>
+    </w:p>
+    <w:p>
+      <w:pPr>
+        <w:keepNext/>
+        <w:bidi/>
+        <w:spacing w:after="20" w:before="0" w:line="300"/>
+      </w:pPr>
+      <w:r>
+        <w:rPr>
+          <w:rFonts w:ascii="Arial" w:cs="Arial" w:hAnsi="Arial"/>
+          <w:b w:val="false"/>
+          <w:i w:val="false"/>
+          <w:color w:val="7A6A55"/>
+          <w:sz w:val="17"/>
+          <w:szCs w:val="17"/>
+          <w:rtl/>
+        </w:rPr>
+        <w:t xml:space="preserve">‏Ep6.zip/Atrash.wav · 36.46–46.70 ث</w:t>
+      </w:r>
+    </w:p>
+    <w:p>
+      <w:pPr>
+        <w:bidi/>
+        <w:spacing w:after="140" w:before="0" w:line="360"/>
+      </w:pPr>
+      <w:r>
+        <w:rPr>
+          <w:rFonts w:ascii="Arial" w:cs="Arial" w:hAnsi="Arial"/>
+          <w:b w:val="false"/>
+          <w:i w:val="false"/>
+          <w:color w:val="2E2419"/>
+          <w:sz w:val="26"/>
+          <w:szCs w:val="26"/>
+          <w:rtl/>
+        </w:rPr>
+        <w:t xml:space="preserve">‏العلم يا بني بحر واسع وكلما تعلم الإنسان أكثر عرف أن أمامه أشياء كثيرة لم يتعلمها بعد</w:t>
+      </w:r>
+    </w:p>
+    <w:p>
+      <w:pPr>
+        <w:keepNext/>
+        <w:bidi/>
+        <w:spacing w:after="20" w:before="0" w:line="300"/>
+      </w:pPr>
+      <w:r>
+        <w:rPr>
+          <w:rFonts w:ascii="Arial" w:cs="Arial" w:hAnsi="Arial"/>
+          <w:b w:val="false"/>
+          <w:i w:val="false"/>
           <w:color w:val="A33A1E"/>
           <w:sz w:val="17"/>
           <w:szCs w:val="17"/>
           <w:rtl/>
         </w:rPr>
-        <w:t xml:space="preserve">‏نسبة الملف إلى الشخصية: ⚠ بالاستبعاد: الشخصية الوحيدة الباقية في قائمة الحلقة، ومضمونه شيخ يسأل عن القرآن ورحلة مكة؛ لكن اسم الملف يشير إلى فريد الأطرش — يحتاج تأكيدا</w:t>
-      </w:r>
-    </w:p>
-    <w:p>
-      <w:pPr>
-        <w:keepNext/>
-        <w:bidi/>
-        <w:spacing w:after="20" w:before="0" w:line="300"/>
-      </w:pPr>
-      <w:r>
-        <w:rPr>
-          <w:rFonts w:ascii="Arial" w:cs="Arial" w:hAnsi="Arial"/>
-          <w:b w:val="false"/>
-          <w:i w:val="false"/>
-          <w:color w:val="7A6A55"/>
-          <w:sz w:val="17"/>
-          <w:szCs w:val="17"/>
-          <w:rtl/>
-        </w:rPr>
-        <w:t xml:space="preserve">‏Ep6.zip/Atrash.wav · 0.00–5.92 ث</w:t>
-      </w:r>
-    </w:p>
-    <w:p>
-      <w:pPr>
-        <w:bidi/>
-        <w:spacing w:after="140" w:before="0" w:line="360"/>
-      </w:pPr>
-      <w:r>
-        <w:rPr>
-          <w:rFonts w:ascii="Arial" w:cs="Arial" w:hAnsi="Arial"/>
-          <w:b w:val="false"/>
-          <w:i w:val="false"/>
-          <w:color w:val="2E2419"/>
-          <w:sz w:val="26"/>
-          <w:szCs w:val="26"/>
-          <w:rtl/>
-        </w:rPr>
-        <w:t xml:space="preserve">‏أهلاً بيك يا أستاذ محمد نورتنا وأهلاً بأهل تونس الكرام</w:t>
-      </w:r>
-    </w:p>
-    <w:p>
-      <w:pPr>
-        <w:keepNext/>
-        <w:bidi/>
-        <w:spacing w:after="20" w:before="0" w:line="300"/>
-      </w:pPr>
-      <w:r>
-        <w:rPr>
-          <w:rFonts w:ascii="Arial" w:cs="Arial" w:hAnsi="Arial"/>
-          <w:b w:val="false"/>
-          <w:i w:val="false"/>
-          <w:color w:val="7A6A55"/>
-          <w:sz w:val="17"/>
-          <w:szCs w:val="17"/>
-          <w:rtl/>
-        </w:rPr>
-        <w:t xml:space="preserve">‏Ep6.zip/Atrash.wav · 7.92–14.82 ث</w:t>
-      </w:r>
-    </w:p>
-    <w:p>
-      <w:pPr>
-        <w:bidi/>
-        <w:spacing w:after="140" w:before="0" w:line="360"/>
-      </w:pPr>
-      <w:r>
-        <w:rPr>
-          <w:rFonts w:ascii="Arial" w:cs="Arial" w:hAnsi="Arial"/>
-          <w:b w:val="false"/>
-          <w:i w:val="false"/>
-          <w:color w:val="2E2419"/>
-          <w:sz w:val="26"/>
-          <w:szCs w:val="26"/>
-          <w:rtl/>
-        </w:rPr>
-        <w:t xml:space="preserve">‏بلغني إنك مهتم بالقرآن والعلم وإنك سافرت بلاداً كثيرة</w:t>
-      </w:r>
-    </w:p>
-    <w:p>
-      <w:pPr>
-        <w:keepNext/>
-        <w:bidi/>
-        <w:spacing w:after="20" w:before="0" w:line="300"/>
-      </w:pPr>
-      <w:r>
-        <w:rPr>
-          <w:rFonts w:ascii="Arial" w:cs="Arial" w:hAnsi="Arial"/>
-          <w:b w:val="false"/>
-          <w:i w:val="false"/>
-          <w:color w:val="7A6A55"/>
-          <w:sz w:val="17"/>
-          <w:szCs w:val="17"/>
-          <w:rtl/>
-        </w:rPr>
-        <w:t xml:space="preserve">‏Ep6.zip/Atrash.wav · 16.70–24.26 ث</w:t>
-      </w:r>
-    </w:p>
-    <w:p>
-      <w:pPr>
-        <w:bidi/>
-        <w:spacing w:after="140" w:before="0" w:line="360"/>
-      </w:pPr>
-      <w:r>
-        <w:rPr>
-          <w:rFonts w:ascii="Arial" w:cs="Arial" w:hAnsi="Arial"/>
-          <w:b w:val="false"/>
-          <w:i w:val="false"/>
-          <w:color w:val="2E2419"/>
-          <w:sz w:val="26"/>
-          <w:szCs w:val="26"/>
-          <w:rtl/>
-        </w:rPr>
-        <w:t xml:space="preserve">‏احكي لنا عن رحلتك إلى مكة كيف كان شعورك وأنت طرى بيت الله الحرام لأول مرة</w:t>
-      </w:r>
-    </w:p>
-    <w:p>
-      <w:pPr>
-        <w:keepNext/>
-        <w:bidi/>
-        <w:spacing w:after="20" w:before="0" w:line="300"/>
-      </w:pPr>
-      <w:r>
-        <w:rPr>
-          <w:rFonts w:ascii="Arial" w:cs="Arial" w:hAnsi="Arial"/>
-          <w:b w:val="false"/>
-          <w:i w:val="false"/>
-          <w:color w:val="7A6A55"/>
-          <w:sz w:val="17"/>
-          <w:szCs w:val="17"/>
-          <w:rtl/>
-        </w:rPr>
-        <w:t xml:space="preserve">‏Ep6.zip/Atrash.wav · 27.52–33.64 ث</w:t>
-      </w:r>
-    </w:p>
-    <w:p>
-      <w:pPr>
-        <w:bidi/>
-        <w:spacing w:after="140" w:before="0" w:line="360"/>
-      </w:pPr>
-      <w:r>
-        <w:rPr>
-          <w:rFonts w:ascii="Arial" w:cs="Arial" w:hAnsi="Arial"/>
-          <w:b w:val="false"/>
-          <w:i w:val="false"/>
-          <w:color w:val="2E2419"/>
-          <w:sz w:val="26"/>
-          <w:szCs w:val="26"/>
-          <w:rtl/>
-        </w:rPr>
-        <w:t xml:space="preserve">‏ما شاء الله واضح إن الرحلة تركت في نفسك أثرا كبيرا</w:t>
-      </w:r>
-    </w:p>
-    <w:p>
-      <w:pPr>
-        <w:keepNext/>
-        <w:bidi/>
-        <w:spacing w:after="20" w:before="0" w:line="300"/>
-      </w:pPr>
-      <w:r>
-        <w:rPr>
-          <w:rFonts w:ascii="Arial" w:cs="Arial" w:hAnsi="Arial"/>
-          <w:b w:val="false"/>
-          <w:i w:val="false"/>
-          <w:color w:val="7A6A55"/>
-          <w:sz w:val="17"/>
-          <w:szCs w:val="17"/>
-          <w:rtl/>
-        </w:rPr>
-        <w:t xml:space="preserve">‏Ep6.zip/Atrash.wav · 36.46–46.70 ث</w:t>
-      </w:r>
-    </w:p>
-    <w:p>
-      <w:pPr>
-        <w:bidi/>
-        <w:spacing w:after="140" w:before="0" w:line="360"/>
-      </w:pPr>
-      <w:r>
-        <w:rPr>
-          <w:rFonts w:ascii="Arial" w:cs="Arial" w:hAnsi="Arial"/>
-          <w:b w:val="false"/>
-          <w:i w:val="false"/>
-          <w:color w:val="2E2419"/>
-          <w:sz w:val="26"/>
-          <w:szCs w:val="26"/>
-          <w:rtl/>
-        </w:rPr>
-        <w:t xml:space="preserve">‏العلم يا بني بحر واسع وكلما تعلم الإنسان أكثر عرف أن أمامه أشياء كثيرة لم يتعلمها بعد</w:t>
-      </w:r>
-    </w:p>
-    <w:p>
-      <w:pPr>
-        <w:keepNext/>
-        <w:bidi/>
-        <w:spacing w:after="20" w:before="0" w:line="300"/>
-      </w:pPr>
-      <w:r>
-        <w:rPr>
-          <w:rFonts w:ascii="Arial" w:cs="Arial" w:hAnsi="Arial"/>
-          <w:b w:val="false"/>
-          <w:i w:val="false"/>
-          <w:color w:val="7A6A55"/>
-          <w:sz w:val="17"/>
-          <w:szCs w:val="17"/>
-          <w:rtl/>
-        </w:rPr>
-        <w:t xml:space="preserve">‏Ep6.zip/Atrash.wav · 48.58–54.98 ث</w:t>
-      </w:r>
-    </w:p>
-    <w:p>
-      <w:pPr>
-        <w:bidi/>
-        <w:spacing w:after="140" w:before="0" w:line="360"/>
-      </w:pPr>
-      <w:r>
-        <w:rPr>
-          <w:rFonts w:ascii="Arial" w:cs="Arial" w:hAnsi="Arial"/>
-          <w:b w:val="false"/>
-          <w:i w:val="false"/>
-          <w:color w:val="2E2419"/>
-          <w:sz w:val="26"/>
-          <w:szCs w:val="26"/>
-          <w:rtl/>
-        </w:rPr>
-        <w:t xml:space="preserve">‏ربنا يوفأك ويفتح عليك ويجعل علمك نافعا لك وللناس</w:t>
+        <w:t xml:space="preserve">‏Ep6.zip/Atrash.wav · 48.58–54.98 ث · ⚠ يختلف التفريغان — راجع بالسماع</w:t>
+      </w:r>
+    </w:p>
+    <w:p>
+      <w:pPr>
+        <w:bidi/>
+        <w:spacing w:after="140" w:before="0" w:line="360"/>
+      </w:pPr>
+      <w:r>
+        <w:rPr>
+          <w:rFonts w:ascii="Arial" w:cs="Arial" w:hAnsi="Arial"/>
+          <w:b w:val="false"/>
+          <w:i w:val="false"/>
+          <w:color w:val="2E2419"/>
+          <w:sz w:val="26"/>
+          <w:szCs w:val="26"/>
+          <w:rtl/>
+        </w:rPr>
+        <w:t xml:space="preserve">‏ربنا يوفقك ويفتح عليك ويجعل علمك نافعا لك وللناس</w:t>
       </w:r>
     </w:p>
     <w:p>
@@ -10323,6 +10608,25 @@
           <w:szCs w:val="17"/>
           <w:rtl/>
         </w:rPr>
+        <w:t xml:space="preserve">‏تصحيح من المنتج: «الأميص» ← «القميص»</w:t>
+      </w:r>
+    </w:p>
+    <w:p>
+      <w:pPr>
+        <w:keepNext/>
+        <w:bidi/>
+        <w:spacing w:after="20" w:before="0" w:line="300"/>
+      </w:pPr>
+      <w:r>
+        <w:rPr>
+          <w:rFonts w:ascii="Arial" w:cs="Arial" w:hAnsi="Arial"/>
+          <w:b w:val="false"/>
+          <w:i w:val="false"/>
+          <w:color w:val="7A6A55"/>
+          <w:sz w:val="17"/>
+          <w:szCs w:val="17"/>
+          <w:rtl/>
+        </w:rPr>
         <w:t xml:space="preserve">‏Ep6.zip/Rashusain.wav · 1.74–6.00 ث</w:t>
       </w:r>
     </w:p>
@@ -10392,30 +10696,30 @@
           <w:rFonts w:ascii="Arial" w:cs="Arial" w:hAnsi="Arial"/>
           <w:b w:val="false"/>
           <w:i w:val="false"/>
-          <w:color w:val="7A6A55"/>
-          <w:sz w:val="17"/>
-          <w:szCs w:val="17"/>
-          <w:rtl/>
-        </w:rPr>
-        <w:t xml:space="preserve">‏Ep6.zip/Rashusain.wav · 16.52–19.56 ث</w:t>
-      </w:r>
-    </w:p>
-    <w:p>
-      <w:pPr>
-        <w:bidi/>
-        <w:spacing w:after="140" w:before="0" w:line="360"/>
-      </w:pPr>
-      <w:r>
-        <w:rPr>
-          <w:rFonts w:ascii="Arial" w:cs="Arial" w:hAnsi="Arial"/>
-          <w:b w:val="false"/>
-          <w:i w:val="false"/>
-          <w:color w:val="2E2419"/>
-          <w:sz w:val="26"/>
-          <w:szCs w:val="26"/>
-          <w:rtl/>
-        </w:rPr>
-        <w:t xml:space="preserve">‏اتفضل شوف الأميص ده</w:t>
+          <w:color w:val="A33A1E"/>
+          <w:sz w:val="17"/>
+          <w:szCs w:val="17"/>
+          <w:rtl/>
+        </w:rPr>
+        <w:t xml:space="preserve">‏Ep6.zip/Rashusain.wav · 16.52–19.56 ث · ⚠ يختلف التفريغان — راجع بالسماع</w:t>
+      </w:r>
+    </w:p>
+    <w:p>
+      <w:pPr>
+        <w:bidi/>
+        <w:spacing w:after="140" w:before="0" w:line="360"/>
+      </w:pPr>
+      <w:r>
+        <w:rPr>
+          <w:rFonts w:ascii="Arial" w:cs="Arial" w:hAnsi="Arial"/>
+          <w:b w:val="false"/>
+          <w:i w:val="false"/>
+          <w:color w:val="2E2419"/>
+          <w:sz w:val="26"/>
+          <w:szCs w:val="26"/>
+          <w:rtl/>
+        </w:rPr>
+        <w:t xml:space="preserve">‏اتفضل شوف القميص ده</w:t>
       </w:r>
     </w:p>
     <w:p>

</xml_diff>

<commit_message>
Producer's corrections: episodes 06
Co-Authored-By: Claude Opus 5.5 <noreply@anthropic.com>
</commit_message>
<xml_diff>
--- a/production/thumma_ihtadayt/recovered_scripts/episodes_01_06/HIKAYA_Thumma_Ihtadayt_Episodes_01-06_Scripts.docx
+++ b/production/thumma_ihtadayt/recovered_scripts/episodes_01_06/HIKAYA_Thumma_Ihtadayt_Episodes_01-06_Scripts.docx
@@ -3972,12 +3972,12 @@
           <w:rFonts w:ascii="Arial" w:cs="Arial" w:hAnsi="Arial"/>
           <w:b w:val="false"/>
           <w:i w:val="false"/>
-          <w:color w:val="A33A1E"/>
-          <w:sz w:val="17"/>
-          <w:szCs w:val="17"/>
-          <w:rtl/>
-        </w:rPr>
-        <w:t xml:space="preserve">‏نسبة الملف إلى الشخصية: ⚠ الملف موجود في Ep4.zip لكن مضمونه من الحلقة الثالثة: زميل في بعثة الحج («وأنت أصغرنا سنا… شرفتنا أمام الوفود المشاركة»)، و«رفيق الرحلة» من شخصيات الحلقة الثالثة المعلومة — يحتاج تأكيدا</w:t>
+          <w:color w:val="7A6A55"/>
+          <w:sz w:val="17"/>
+          <w:szCs w:val="17"/>
+          <w:rtl/>
+        </w:rPr>
+        <w:t xml:space="preserve">‏نسبة الملف إلى الشخصية: أكده المنتج: «رفيق الرحلة» في الحلقة الثالثة (الملف في Ep4.zip)</w:t>
       </w:r>
     </w:p>
     <w:p>
@@ -5804,12 +5804,12 @@
           <w:rFonts w:ascii="Arial" w:cs="Arial" w:hAnsi="Arial"/>
           <w:b w:val="false"/>
           <w:i w:val="false"/>
-          <w:color w:val="A33A1E"/>
-          <w:sz w:val="17"/>
-          <w:szCs w:val="17"/>
-          <w:rtl/>
-        </w:rPr>
-        <w:t xml:space="preserve">‏نسبة الملف إلى الشخصية: ⚠ الملف موجود في Ep3.zip لكن مضمونه من الحلقة الرابعة: طالب يسأل «أستاذ محمد» عن اعتراضه على زيارة الأضرحة بعد عودته من الحج، و«أحد الطلاب» من شخصيات الحلقة الرابعة المعلومة — يحتاج تأكيدا</w:t>
+          <w:color w:val="7A6A55"/>
+          <w:sz w:val="17"/>
+          <w:szCs w:val="17"/>
+          <w:rtl/>
+        </w:rPr>
+        <w:t xml:space="preserve">‏نسبة الملف إلى الشخصية: أكده المنتج: «أحد الطلاب» في الحلقة الرابعة (الملف في Ep3.zip)</w:t>
       </w:r>
     </w:p>
     <w:p>
@@ -8554,6 +8554,25 @@
           <w:szCs w:val="17"/>
           <w:rtl/>
         </w:rPr>
+        <w:t xml:space="preserve">‏تصحيح من المنتج: «باكية» ← «باكيا»</w:t>
+      </w:r>
+    </w:p>
+    <w:p>
+      <w:pPr>
+        <w:keepNext/>
+        <w:bidi/>
+        <w:spacing w:after="20" w:before="0" w:line="300"/>
+      </w:pPr>
+      <w:r>
+        <w:rPr>
+          <w:rFonts w:ascii="Arial" w:cs="Arial" w:hAnsi="Arial"/>
+          <w:b w:val="false"/>
+          <w:i w:val="false"/>
+          <w:color w:val="7A6A55"/>
+          <w:sz w:val="17"/>
+          <w:szCs w:val="17"/>
+          <w:rtl/>
+        </w:rPr>
         <w:t xml:space="preserve">‏Ep6.zip/Narration.wav · 0.00–11.58 ث</w:t>
       </w:r>
     </w:p>
@@ -8905,7 +8924,7 @@
           <w:szCs w:val="26"/>
           <w:rtl/>
         </w:rPr>
-        <w:t xml:space="preserve">‏خرج محمد من تلك الحجرة باكية كان يرى في تلك اللحظة علامة عناية إلهية خاصة به لكن التجربة لم تمنحه السكينة وحدها بل أيقضت في داخله أسئلة جديدة</w:t>
+        <w:t xml:space="preserve">‏خرج محمد من تلك الحجرة باكيا كان يرى في تلك اللحظة علامة عناية إلهية خاصة به لكن التجربة لم تمنحه السكينة وحدها بل أيقضت في داخله أسئلة جديدة</w:t>
       </w:r>
     </w:p>
     <w:p>

</xml_diff>